<commit_message>
Day 3: random proposal draw in Live mode
Students tap their side, then "Get my proposal" draws one at random. The
draw is saved and never re-rolls; a "teacher moved me" drop-down lets the
teacher fill gaps. Teacher page setup and pacing notes updated to match.

Co-Authored-By: Claude Opus 5.5 (1M context) <noreply@anthropic.com>
</commit_message>
<xml_diff>
--- a/road-to-revolution/Day3_Response_Sheet.docx
+++ b/road-to-revolution/Day3_Response_Sheet.docx
@@ -142,7 +142,7 @@
           <w:i w:val="0"/>
           <w:sz w:val="20"/>
         </w:rPr>
-        <w:t>count off 1–5 so each proposal has about 6 students. Check that each group has at least one Patriot, one Loyalist, and one Neutralist (from identity cards). Everyone writes a speech or question; you pick one speaker per side for each proposal.</w:t>
+        <w:t>students tap their side, and the screen draws a random proposal. While they write, call “Proposal 1 Patriots, hands up” (and so on) to check each proposal has a Patriot, a Loyalist, and a Neutralist. Fill any gap by moving a student from a group with extras (they tap “Did your teacher move you?” in Part I). You pick one speaker per side for each proposal.</w:t>
       </w:r>
     </w:p>
     <w:p>
@@ -334,7 +334,7 @@
                 <w:i w:val="0"/>
                 <w:sz w:val="18"/>
               </w:rPr>
-              <w:t>Open file, press Live. Part I: tap proposal # and side.</w:t>
+              <w:t>Open file, press Live. Part I: tap side, get random proposal.</w:t>
             </w:r>
           </w:p>
         </w:tc>

</xml_diff>